<commit_message>
Docs : démarche créative Word, couleurs neutres
Co-Authored-By: Claude Sonnet 5.5 <noreply@anthropic.com>
Claude-Session: https://claude.ai/code/session_01Tyi6eDbg9tiPNQSmjUDNCJ
</commit_message>
<xml_diff>
--- a/docs/Demarche-creative-HotKB.docx
+++ b/docs/Demarche-creative-HotKB.docx
@@ -10,7 +10,7 @@
         <w:rPr>
           <w:b/>
           <w:bCs/>
-          <w:color w:val="D93A0F"/>
+          <w:color w:val="2B2B2B"/>
           <w:sz w:val="52"/>
           <w:szCs w:val="52"/>
         </w:rPr>
@@ -23,7 +23,7 @@
       </w:pPr>
       <w:r>
         <w:rPr>
-          <w:color w:val="5A2A1E"/>
+          <w:color w:val="404040"/>
           <w:sz w:val="28"/>
           <w:szCs w:val="28"/>
         </w:rPr>
@@ -33,13 +33,13 @@
     <w:p>
       <w:pPr>
         <w:pBdr>
-          <w:bottom w:val="single" w:color="D93A0F" w:sz="8" w:space="6"/>
+          <w:bottom w:val="single" w:color="2B2B2B" w:sz="8" w:space="6"/>
         </w:pBdr>
         <w:spacing w:after="240"/>
       </w:pPr>
       <w:r>
         <w:rPr>
-          <w:color w:val="7A5B50"/>
+          <w:color w:val="6B6B6B"/>
           <w:sz w:val="20"/>
           <w:szCs w:val="20"/>
         </w:rPr>
@@ -473,12 +473,12 @@
           <w:tcPr>
             <w:tcW w:type="dxa" w:w="1900"/>
             <w:tcBorders>
-              <w:top w:val="single" w:color="D9C9BF" w:sz="4"/>
-              <w:left w:val="single" w:color="D9C9BF" w:sz="4"/>
-              <w:bottom w:val="single" w:color="D9C9BF" w:sz="4"/>
-              <w:right w:val="single" w:color="D9C9BF" w:sz="4"/>
-            </w:tcBorders>
-            <w:shd w:fill="FFE7DC" w:color="auto" w:val="clear"/>
+              <w:top w:val="single" w:color="CFCFCF" w:sz="4"/>
+              <w:left w:val="single" w:color="CFCFCF" w:sz="4"/>
+              <w:bottom w:val="single" w:color="CFCFCF" w:sz="4"/>
+              <w:right w:val="single" w:color="CFCFCF" w:sz="4"/>
+            </w:tcBorders>
+            <w:shd w:fill="EDEDED" w:color="auto" w:val="clear"/>
             <w:tcMar>
               <w:top w:type="dxa" w:w="80"/>
               <w:left w:type="dxa" w:w="110"/>
@@ -505,12 +505,12 @@
           <w:tcPr>
             <w:tcW w:type="dxa" w:w="3900"/>
             <w:tcBorders>
-              <w:top w:val="single" w:color="D9C9BF" w:sz="4"/>
-              <w:left w:val="single" w:color="D9C9BF" w:sz="4"/>
-              <w:bottom w:val="single" w:color="D9C9BF" w:sz="4"/>
-              <w:right w:val="single" w:color="D9C9BF" w:sz="4"/>
-            </w:tcBorders>
-            <w:shd w:fill="FFE7DC" w:color="auto" w:val="clear"/>
+              <w:top w:val="single" w:color="CFCFCF" w:sz="4"/>
+              <w:left w:val="single" w:color="CFCFCF" w:sz="4"/>
+              <w:bottom w:val="single" w:color="CFCFCF" w:sz="4"/>
+              <w:right w:val="single" w:color="CFCFCF" w:sz="4"/>
+            </w:tcBorders>
+            <w:shd w:fill="EDEDED" w:color="auto" w:val="clear"/>
             <w:tcMar>
               <w:top w:type="dxa" w:w="80"/>
               <w:left w:type="dxa" w:w="110"/>
@@ -537,12 +537,12 @@
           <w:tcPr>
             <w:tcW w:type="dxa" w:w="3560"/>
             <w:tcBorders>
-              <w:top w:val="single" w:color="D9C9BF" w:sz="4"/>
-              <w:left w:val="single" w:color="D9C9BF" w:sz="4"/>
-              <w:bottom w:val="single" w:color="D9C9BF" w:sz="4"/>
-              <w:right w:val="single" w:color="D9C9BF" w:sz="4"/>
-            </w:tcBorders>
-            <w:shd w:fill="FFE7DC" w:color="auto" w:val="clear"/>
+              <w:top w:val="single" w:color="CFCFCF" w:sz="4"/>
+              <w:left w:val="single" w:color="CFCFCF" w:sz="4"/>
+              <w:bottom w:val="single" w:color="CFCFCF" w:sz="4"/>
+              <w:right w:val="single" w:color="CFCFCF" w:sz="4"/>
+            </w:tcBorders>
+            <w:shd w:fill="EDEDED" w:color="auto" w:val="clear"/>
             <w:tcMar>
               <w:top w:type="dxa" w:w="80"/>
               <w:left w:type="dxa" w:w="110"/>
@@ -574,10 +574,10 @@
           <w:tcPr>
             <w:tcW w:type="dxa" w:w="1900"/>
             <w:tcBorders>
-              <w:top w:val="single" w:color="D9C9BF" w:sz="4"/>
-              <w:left w:val="single" w:color="D9C9BF" w:sz="4"/>
-              <w:bottom w:val="single" w:color="D9C9BF" w:sz="4"/>
-              <w:right w:val="single" w:color="D9C9BF" w:sz="4"/>
+              <w:top w:val="single" w:color="CFCFCF" w:sz="4"/>
+              <w:left w:val="single" w:color="CFCFCF" w:sz="4"/>
+              <w:bottom w:val="single" w:color="CFCFCF" w:sz="4"/>
+              <w:right w:val="single" w:color="CFCFCF" w:sz="4"/>
             </w:tcBorders>
             <w:tcMar>
               <w:top w:type="dxa" w:w="80"/>
@@ -605,10 +605,10 @@
           <w:tcPr>
             <w:tcW w:type="dxa" w:w="3900"/>
             <w:tcBorders>
-              <w:top w:val="single" w:color="D9C9BF" w:sz="4"/>
-              <w:left w:val="single" w:color="D9C9BF" w:sz="4"/>
-              <w:bottom w:val="single" w:color="D9C9BF" w:sz="4"/>
-              <w:right w:val="single" w:color="D9C9BF" w:sz="4"/>
+              <w:top w:val="single" w:color="CFCFCF" w:sz="4"/>
+              <w:left w:val="single" w:color="CFCFCF" w:sz="4"/>
+              <w:bottom w:val="single" w:color="CFCFCF" w:sz="4"/>
+              <w:right w:val="single" w:color="CFCFCF" w:sz="4"/>
             </w:tcBorders>
             <w:tcMar>
               <w:top w:type="dxa" w:w="80"/>
@@ -634,10 +634,10 @@
           <w:tcPr>
             <w:tcW w:type="dxa" w:w="3560"/>
             <w:tcBorders>
-              <w:top w:val="single" w:color="D9C9BF" w:sz="4"/>
-              <w:left w:val="single" w:color="D9C9BF" w:sz="4"/>
-              <w:bottom w:val="single" w:color="D9C9BF" w:sz="4"/>
-              <w:right w:val="single" w:color="D9C9BF" w:sz="4"/>
+              <w:top w:val="single" w:color="CFCFCF" w:sz="4"/>
+              <w:left w:val="single" w:color="CFCFCF" w:sz="4"/>
+              <w:bottom w:val="single" w:color="CFCFCF" w:sz="4"/>
+              <w:right w:val="single" w:color="CFCFCF" w:sz="4"/>
             </w:tcBorders>
             <w:tcMar>
               <w:top w:type="dxa" w:w="80"/>
@@ -668,10 +668,10 @@
           <w:tcPr>
             <w:tcW w:type="dxa" w:w="1900"/>
             <w:tcBorders>
-              <w:top w:val="single" w:color="D9C9BF" w:sz="4"/>
-              <w:left w:val="single" w:color="D9C9BF" w:sz="4"/>
-              <w:bottom w:val="single" w:color="D9C9BF" w:sz="4"/>
-              <w:right w:val="single" w:color="D9C9BF" w:sz="4"/>
+              <w:top w:val="single" w:color="CFCFCF" w:sz="4"/>
+              <w:left w:val="single" w:color="CFCFCF" w:sz="4"/>
+              <w:bottom w:val="single" w:color="CFCFCF" w:sz="4"/>
+              <w:right w:val="single" w:color="CFCFCF" w:sz="4"/>
             </w:tcBorders>
             <w:tcMar>
               <w:top w:type="dxa" w:w="80"/>
@@ -699,10 +699,10 @@
           <w:tcPr>
             <w:tcW w:type="dxa" w:w="3900"/>
             <w:tcBorders>
-              <w:top w:val="single" w:color="D9C9BF" w:sz="4"/>
-              <w:left w:val="single" w:color="D9C9BF" w:sz="4"/>
-              <w:bottom w:val="single" w:color="D9C9BF" w:sz="4"/>
-              <w:right w:val="single" w:color="D9C9BF" w:sz="4"/>
+              <w:top w:val="single" w:color="CFCFCF" w:sz="4"/>
+              <w:left w:val="single" w:color="CFCFCF" w:sz="4"/>
+              <w:bottom w:val="single" w:color="CFCFCF" w:sz="4"/>
+              <w:right w:val="single" w:color="CFCFCF" w:sz="4"/>
             </w:tcBorders>
             <w:tcMar>
               <w:top w:type="dxa" w:w="80"/>
@@ -728,10 +728,10 @@
           <w:tcPr>
             <w:tcW w:type="dxa" w:w="3560"/>
             <w:tcBorders>
-              <w:top w:val="single" w:color="D9C9BF" w:sz="4"/>
-              <w:left w:val="single" w:color="D9C9BF" w:sz="4"/>
-              <w:bottom w:val="single" w:color="D9C9BF" w:sz="4"/>
-              <w:right w:val="single" w:color="D9C9BF" w:sz="4"/>
+              <w:top w:val="single" w:color="CFCFCF" w:sz="4"/>
+              <w:left w:val="single" w:color="CFCFCF" w:sz="4"/>
+              <w:bottom w:val="single" w:color="CFCFCF" w:sz="4"/>
+              <w:right w:val="single" w:color="CFCFCF" w:sz="4"/>
             </w:tcBorders>
             <w:tcMar>
               <w:top w:type="dxa" w:w="80"/>
@@ -762,10 +762,10 @@
           <w:tcPr>
             <w:tcW w:type="dxa" w:w="1900"/>
             <w:tcBorders>
-              <w:top w:val="single" w:color="D9C9BF" w:sz="4"/>
-              <w:left w:val="single" w:color="D9C9BF" w:sz="4"/>
-              <w:bottom w:val="single" w:color="D9C9BF" w:sz="4"/>
-              <w:right w:val="single" w:color="D9C9BF" w:sz="4"/>
+              <w:top w:val="single" w:color="CFCFCF" w:sz="4"/>
+              <w:left w:val="single" w:color="CFCFCF" w:sz="4"/>
+              <w:bottom w:val="single" w:color="CFCFCF" w:sz="4"/>
+              <w:right w:val="single" w:color="CFCFCF" w:sz="4"/>
             </w:tcBorders>
             <w:tcMar>
               <w:top w:type="dxa" w:w="80"/>
@@ -793,10 +793,10 @@
           <w:tcPr>
             <w:tcW w:type="dxa" w:w="3900"/>
             <w:tcBorders>
-              <w:top w:val="single" w:color="D9C9BF" w:sz="4"/>
-              <w:left w:val="single" w:color="D9C9BF" w:sz="4"/>
-              <w:bottom w:val="single" w:color="D9C9BF" w:sz="4"/>
-              <w:right w:val="single" w:color="D9C9BF" w:sz="4"/>
+              <w:top w:val="single" w:color="CFCFCF" w:sz="4"/>
+              <w:left w:val="single" w:color="CFCFCF" w:sz="4"/>
+              <w:bottom w:val="single" w:color="CFCFCF" w:sz="4"/>
+              <w:right w:val="single" w:color="CFCFCF" w:sz="4"/>
             </w:tcBorders>
             <w:tcMar>
               <w:top w:type="dxa" w:w="80"/>
@@ -822,10 +822,10 @@
           <w:tcPr>
             <w:tcW w:type="dxa" w:w="3560"/>
             <w:tcBorders>
-              <w:top w:val="single" w:color="D9C9BF" w:sz="4"/>
-              <w:left w:val="single" w:color="D9C9BF" w:sz="4"/>
-              <w:bottom w:val="single" w:color="D9C9BF" w:sz="4"/>
-              <w:right w:val="single" w:color="D9C9BF" w:sz="4"/>
+              <w:top w:val="single" w:color="CFCFCF" w:sz="4"/>
+              <w:left w:val="single" w:color="CFCFCF" w:sz="4"/>
+              <w:bottom w:val="single" w:color="CFCFCF" w:sz="4"/>
+              <w:right w:val="single" w:color="CFCFCF" w:sz="4"/>
             </w:tcBorders>
             <w:tcMar>
               <w:top w:type="dxa" w:w="80"/>
@@ -856,10 +856,10 @@
           <w:tcPr>
             <w:tcW w:type="dxa" w:w="1900"/>
             <w:tcBorders>
-              <w:top w:val="single" w:color="D9C9BF" w:sz="4"/>
-              <w:left w:val="single" w:color="D9C9BF" w:sz="4"/>
-              <w:bottom w:val="single" w:color="D9C9BF" w:sz="4"/>
-              <w:right w:val="single" w:color="D9C9BF" w:sz="4"/>
+              <w:top w:val="single" w:color="CFCFCF" w:sz="4"/>
+              <w:left w:val="single" w:color="CFCFCF" w:sz="4"/>
+              <w:bottom w:val="single" w:color="CFCFCF" w:sz="4"/>
+              <w:right w:val="single" w:color="CFCFCF" w:sz="4"/>
             </w:tcBorders>
             <w:tcMar>
               <w:top w:type="dxa" w:w="80"/>
@@ -887,10 +887,10 @@
           <w:tcPr>
             <w:tcW w:type="dxa" w:w="3900"/>
             <w:tcBorders>
-              <w:top w:val="single" w:color="D9C9BF" w:sz="4"/>
-              <w:left w:val="single" w:color="D9C9BF" w:sz="4"/>
-              <w:bottom w:val="single" w:color="D9C9BF" w:sz="4"/>
-              <w:right w:val="single" w:color="D9C9BF" w:sz="4"/>
+              <w:top w:val="single" w:color="CFCFCF" w:sz="4"/>
+              <w:left w:val="single" w:color="CFCFCF" w:sz="4"/>
+              <w:bottom w:val="single" w:color="CFCFCF" w:sz="4"/>
+              <w:right w:val="single" w:color="CFCFCF" w:sz="4"/>
             </w:tcBorders>
             <w:tcMar>
               <w:top w:type="dxa" w:w="80"/>
@@ -916,10 +916,10 @@
           <w:tcPr>
             <w:tcW w:type="dxa" w:w="3560"/>
             <w:tcBorders>
-              <w:top w:val="single" w:color="D9C9BF" w:sz="4"/>
-              <w:left w:val="single" w:color="D9C9BF" w:sz="4"/>
-              <w:bottom w:val="single" w:color="D9C9BF" w:sz="4"/>
-              <w:right w:val="single" w:color="D9C9BF" w:sz="4"/>
+              <w:top w:val="single" w:color="CFCFCF" w:sz="4"/>
+              <w:left w:val="single" w:color="CFCFCF" w:sz="4"/>
+              <w:bottom w:val="single" w:color="CFCFCF" w:sz="4"/>
+              <w:right w:val="single" w:color="CFCFCF" w:sz="4"/>
             </w:tcBorders>
             <w:tcMar>
               <w:top w:type="dxa" w:w="80"/>
@@ -1006,12 +1006,12 @@
           <w:tcPr>
             <w:tcW w:type="dxa" w:w="2700"/>
             <w:tcBorders>
-              <w:top w:val="single" w:color="D9C9BF" w:sz="4"/>
-              <w:left w:val="single" w:color="D9C9BF" w:sz="4"/>
-              <w:bottom w:val="single" w:color="D9C9BF" w:sz="4"/>
-              <w:right w:val="single" w:color="D9C9BF" w:sz="4"/>
-            </w:tcBorders>
-            <w:shd w:fill="FFE7DC" w:color="auto" w:val="clear"/>
+              <w:top w:val="single" w:color="CFCFCF" w:sz="4"/>
+              <w:left w:val="single" w:color="CFCFCF" w:sz="4"/>
+              <w:bottom w:val="single" w:color="CFCFCF" w:sz="4"/>
+              <w:right w:val="single" w:color="CFCFCF" w:sz="4"/>
+            </w:tcBorders>
+            <w:shd w:fill="EDEDED" w:color="auto" w:val="clear"/>
             <w:tcMar>
               <w:top w:type="dxa" w:w="80"/>
               <w:left w:type="dxa" w:w="110"/>
@@ -1038,12 +1038,12 @@
           <w:tcPr>
             <w:tcW w:type="dxa" w:w="1500"/>
             <w:tcBorders>
-              <w:top w:val="single" w:color="D9C9BF" w:sz="4"/>
-              <w:left w:val="single" w:color="D9C9BF" w:sz="4"/>
-              <w:bottom w:val="single" w:color="D9C9BF" w:sz="4"/>
-              <w:right w:val="single" w:color="D9C9BF" w:sz="4"/>
-            </w:tcBorders>
-            <w:shd w:fill="FFE7DC" w:color="auto" w:val="clear"/>
+              <w:top w:val="single" w:color="CFCFCF" w:sz="4"/>
+              <w:left w:val="single" w:color="CFCFCF" w:sz="4"/>
+              <w:bottom w:val="single" w:color="CFCFCF" w:sz="4"/>
+              <w:right w:val="single" w:color="CFCFCF" w:sz="4"/>
+            </w:tcBorders>
+            <w:shd w:fill="EDEDED" w:color="auto" w:val="clear"/>
             <w:tcMar>
               <w:top w:type="dxa" w:w="80"/>
               <w:left w:type="dxa" w:w="110"/>
@@ -1070,12 +1070,12 @@
           <w:tcPr>
             <w:tcW w:type="dxa" w:w="1500"/>
             <w:tcBorders>
-              <w:top w:val="single" w:color="D9C9BF" w:sz="4"/>
-              <w:left w:val="single" w:color="D9C9BF" w:sz="4"/>
-              <w:bottom w:val="single" w:color="D9C9BF" w:sz="4"/>
-              <w:right w:val="single" w:color="D9C9BF" w:sz="4"/>
-            </w:tcBorders>
-            <w:shd w:fill="FFE7DC" w:color="auto" w:val="clear"/>
+              <w:top w:val="single" w:color="CFCFCF" w:sz="4"/>
+              <w:left w:val="single" w:color="CFCFCF" w:sz="4"/>
+              <w:bottom w:val="single" w:color="CFCFCF" w:sz="4"/>
+              <w:right w:val="single" w:color="CFCFCF" w:sz="4"/>
+            </w:tcBorders>
+            <w:shd w:fill="EDEDED" w:color="auto" w:val="clear"/>
             <w:tcMar>
               <w:top w:type="dxa" w:w="80"/>
               <w:left w:type="dxa" w:w="110"/>
@@ -1102,12 +1102,12 @@
           <w:tcPr>
             <w:tcW w:type="dxa" w:w="3660"/>
             <w:tcBorders>
-              <w:top w:val="single" w:color="D9C9BF" w:sz="4"/>
-              <w:left w:val="single" w:color="D9C9BF" w:sz="4"/>
-              <w:bottom w:val="single" w:color="D9C9BF" w:sz="4"/>
-              <w:right w:val="single" w:color="D9C9BF" w:sz="4"/>
-            </w:tcBorders>
-            <w:shd w:fill="FFE7DC" w:color="auto" w:val="clear"/>
+              <w:top w:val="single" w:color="CFCFCF" w:sz="4"/>
+              <w:left w:val="single" w:color="CFCFCF" w:sz="4"/>
+              <w:bottom w:val="single" w:color="CFCFCF" w:sz="4"/>
+              <w:right w:val="single" w:color="CFCFCF" w:sz="4"/>
+            </w:tcBorders>
+            <w:shd w:fill="EDEDED" w:color="auto" w:val="clear"/>
             <w:tcMar>
               <w:top w:type="dxa" w:w="80"/>
               <w:left w:type="dxa" w:w="110"/>
@@ -1139,10 +1139,10 @@
           <w:tcPr>
             <w:tcW w:type="dxa" w:w="2700"/>
             <w:tcBorders>
-              <w:top w:val="single" w:color="D9C9BF" w:sz="4"/>
-              <w:left w:val="single" w:color="D9C9BF" w:sz="4"/>
-              <w:bottom w:val="single" w:color="D9C9BF" w:sz="4"/>
-              <w:right w:val="single" w:color="D9C9BF" w:sz="4"/>
+              <w:top w:val="single" w:color="CFCFCF" w:sz="4"/>
+              <w:left w:val="single" w:color="CFCFCF" w:sz="4"/>
+              <w:bottom w:val="single" w:color="CFCFCF" w:sz="4"/>
+              <w:right w:val="single" w:color="CFCFCF" w:sz="4"/>
             </w:tcBorders>
             <w:tcMar>
               <w:top w:type="dxa" w:w="80"/>
@@ -1170,10 +1170,10 @@
           <w:tcPr>
             <w:tcW w:type="dxa" w:w="1500"/>
             <w:tcBorders>
-              <w:top w:val="single" w:color="D9C9BF" w:sz="4"/>
-              <w:left w:val="single" w:color="D9C9BF" w:sz="4"/>
-              <w:bottom w:val="single" w:color="D9C9BF" w:sz="4"/>
-              <w:right w:val="single" w:color="D9C9BF" w:sz="4"/>
+              <w:top w:val="single" w:color="CFCFCF" w:sz="4"/>
+              <w:left w:val="single" w:color="CFCFCF" w:sz="4"/>
+              <w:bottom w:val="single" w:color="CFCFCF" w:sz="4"/>
+              <w:right w:val="single" w:color="CFCFCF" w:sz="4"/>
             </w:tcBorders>
             <w:shd w:fill="FF4F1F" w:color="auto" w:val="clear"/>
             <w:tcMar>
@@ -1201,10 +1201,10 @@
           <w:tcPr>
             <w:tcW w:type="dxa" w:w="1500"/>
             <w:tcBorders>
-              <w:top w:val="single" w:color="D9C9BF" w:sz="4"/>
-              <w:left w:val="single" w:color="D9C9BF" w:sz="4"/>
-              <w:bottom w:val="single" w:color="D9C9BF" w:sz="4"/>
-              <w:right w:val="single" w:color="D9C9BF" w:sz="4"/>
+              <w:top w:val="single" w:color="CFCFCF" w:sz="4"/>
+              <w:left w:val="single" w:color="CFCFCF" w:sz="4"/>
+              <w:bottom w:val="single" w:color="CFCFCF" w:sz="4"/>
+              <w:right w:val="single" w:color="CFCFCF" w:sz="4"/>
             </w:tcBorders>
             <w:shd w:fill="FF6A3D" w:color="auto" w:val="clear"/>
             <w:tcMar>
@@ -1232,10 +1232,10 @@
           <w:tcPr>
             <w:tcW w:type="dxa" w:w="3660"/>
             <w:tcBorders>
-              <w:top w:val="single" w:color="D9C9BF" w:sz="4"/>
-              <w:left w:val="single" w:color="D9C9BF" w:sz="4"/>
-              <w:bottom w:val="single" w:color="D9C9BF" w:sz="4"/>
-              <w:right w:val="single" w:color="D9C9BF" w:sz="4"/>
+              <w:top w:val="single" w:color="CFCFCF" w:sz="4"/>
+              <w:left w:val="single" w:color="CFCFCF" w:sz="4"/>
+              <w:bottom w:val="single" w:color="CFCFCF" w:sz="4"/>
+              <w:right w:val="single" w:color="CFCFCF" w:sz="4"/>
             </w:tcBorders>
             <w:tcMar>
               <w:top w:type="dxa" w:w="80"/>
@@ -1266,10 +1266,10 @@
           <w:tcPr>
             <w:tcW w:type="dxa" w:w="2700"/>
             <w:tcBorders>
-              <w:top w:val="single" w:color="D9C9BF" w:sz="4"/>
-              <w:left w:val="single" w:color="D9C9BF" w:sz="4"/>
-              <w:bottom w:val="single" w:color="D9C9BF" w:sz="4"/>
-              <w:right w:val="single" w:color="D9C9BF" w:sz="4"/>
+              <w:top w:val="single" w:color="CFCFCF" w:sz="4"/>
+              <w:left w:val="single" w:color="CFCFCF" w:sz="4"/>
+              <w:bottom w:val="single" w:color="CFCFCF" w:sz="4"/>
+              <w:right w:val="single" w:color="CFCFCF" w:sz="4"/>
             </w:tcBorders>
             <w:tcMar>
               <w:top w:type="dxa" w:w="80"/>
@@ -1297,10 +1297,10 @@
           <w:tcPr>
             <w:tcW w:type="dxa" w:w="1500"/>
             <w:tcBorders>
-              <w:top w:val="single" w:color="D9C9BF" w:sz="4"/>
-              <w:left w:val="single" w:color="D9C9BF" w:sz="4"/>
-              <w:bottom w:val="single" w:color="D9C9BF" w:sz="4"/>
-              <w:right w:val="single" w:color="D9C9BF" w:sz="4"/>
+              <w:top w:val="single" w:color="CFCFCF" w:sz="4"/>
+              <w:left w:val="single" w:color="CFCFCF" w:sz="4"/>
+              <w:bottom w:val="single" w:color="CFCFCF" w:sz="4"/>
+              <w:right w:val="single" w:color="CFCFCF" w:sz="4"/>
             </w:tcBorders>
             <w:shd w:fill="FFB347" w:color="auto" w:val="clear"/>
             <w:tcMar>
@@ -1328,10 +1328,10 @@
           <w:tcPr>
             <w:tcW w:type="dxa" w:w="1500"/>
             <w:tcBorders>
-              <w:top w:val="single" w:color="D9C9BF" w:sz="4"/>
-              <w:left w:val="single" w:color="D9C9BF" w:sz="4"/>
-              <w:bottom w:val="single" w:color="D9C9BF" w:sz="4"/>
-              <w:right w:val="single" w:color="D9C9BF" w:sz="4"/>
+              <w:top w:val="single" w:color="CFCFCF" w:sz="4"/>
+              <w:left w:val="single" w:color="CFCFCF" w:sz="4"/>
+              <w:bottom w:val="single" w:color="CFCFCF" w:sz="4"/>
+              <w:right w:val="single" w:color="CFCFCF" w:sz="4"/>
             </w:tcBorders>
             <w:shd w:fill="FFCB66" w:color="auto" w:val="clear"/>
             <w:tcMar>
@@ -1359,10 +1359,10 @@
           <w:tcPr>
             <w:tcW w:type="dxa" w:w="3660"/>
             <w:tcBorders>
-              <w:top w:val="single" w:color="D9C9BF" w:sz="4"/>
-              <w:left w:val="single" w:color="D9C9BF" w:sz="4"/>
-              <w:bottom w:val="single" w:color="D9C9BF" w:sz="4"/>
-              <w:right w:val="single" w:color="D9C9BF" w:sz="4"/>
+              <w:top w:val="single" w:color="CFCFCF" w:sz="4"/>
+              <w:left w:val="single" w:color="CFCFCF" w:sz="4"/>
+              <w:bottom w:val="single" w:color="CFCFCF" w:sz="4"/>
+              <w:right w:val="single" w:color="CFCFCF" w:sz="4"/>
             </w:tcBorders>
             <w:tcMar>
               <w:top w:type="dxa" w:w="80"/>
@@ -1393,10 +1393,10 @@
           <w:tcPr>
             <w:tcW w:type="dxa" w:w="2700"/>
             <w:tcBorders>
-              <w:top w:val="single" w:color="D9C9BF" w:sz="4"/>
-              <w:left w:val="single" w:color="D9C9BF" w:sz="4"/>
-              <w:bottom w:val="single" w:color="D9C9BF" w:sz="4"/>
-              <w:right w:val="single" w:color="D9C9BF" w:sz="4"/>
+              <w:top w:val="single" w:color="CFCFCF" w:sz="4"/>
+              <w:left w:val="single" w:color="CFCFCF" w:sz="4"/>
+              <w:bottom w:val="single" w:color="CFCFCF" w:sz="4"/>
+              <w:right w:val="single" w:color="CFCFCF" w:sz="4"/>
             </w:tcBorders>
             <w:tcMar>
               <w:top w:type="dxa" w:w="80"/>
@@ -1424,10 +1424,10 @@
           <w:tcPr>
             <w:tcW w:type="dxa" w:w="1500"/>
             <w:tcBorders>
-              <w:top w:val="single" w:color="D9C9BF" w:sz="4"/>
-              <w:left w:val="single" w:color="D9C9BF" w:sz="4"/>
-              <w:bottom w:val="single" w:color="D9C9BF" w:sz="4"/>
-              <w:right w:val="single" w:color="D9C9BF" w:sz="4"/>
+              <w:top w:val="single" w:color="CFCFCF" w:sz="4"/>
+              <w:left w:val="single" w:color="CFCFCF" w:sz="4"/>
+              <w:bottom w:val="single" w:color="CFCFCF" w:sz="4"/>
+              <w:right w:val="single" w:color="CFCFCF" w:sz="4"/>
             </w:tcBorders>
             <w:shd w:fill="FFC825" w:color="auto" w:val="clear"/>
             <w:tcMar>
@@ -1455,10 +1455,10 @@
           <w:tcPr>
             <w:tcW w:type="dxa" w:w="1500"/>
             <w:tcBorders>
-              <w:top w:val="single" w:color="D9C9BF" w:sz="4"/>
-              <w:left w:val="single" w:color="D9C9BF" w:sz="4"/>
-              <w:bottom w:val="single" w:color="D9C9BF" w:sz="4"/>
-              <w:right w:val="single" w:color="D9C9BF" w:sz="4"/>
+              <w:top w:val="single" w:color="CFCFCF" w:sz="4"/>
+              <w:left w:val="single" w:color="CFCFCF" w:sz="4"/>
+              <w:bottom w:val="single" w:color="CFCFCF" w:sz="4"/>
+              <w:right w:val="single" w:color="CFCFCF" w:sz="4"/>
             </w:tcBorders>
             <w:shd w:fill="FFD454" w:color="auto" w:val="clear"/>
             <w:tcMar>
@@ -1486,10 +1486,10 @@
           <w:tcPr>
             <w:tcW w:type="dxa" w:w="3660"/>
             <w:tcBorders>
-              <w:top w:val="single" w:color="D9C9BF" w:sz="4"/>
-              <w:left w:val="single" w:color="D9C9BF" w:sz="4"/>
-              <w:bottom w:val="single" w:color="D9C9BF" w:sz="4"/>
-              <w:right w:val="single" w:color="D9C9BF" w:sz="4"/>
+              <w:top w:val="single" w:color="CFCFCF" w:sz="4"/>
+              <w:left w:val="single" w:color="CFCFCF" w:sz="4"/>
+              <w:bottom w:val="single" w:color="CFCFCF" w:sz="4"/>
+              <w:right w:val="single" w:color="CFCFCF" w:sz="4"/>
             </w:tcBorders>
             <w:tcMar>
               <w:top w:type="dxa" w:w="80"/>
@@ -1520,10 +1520,10 @@
           <w:tcPr>
             <w:tcW w:type="dxa" w:w="2700"/>
             <w:tcBorders>
-              <w:top w:val="single" w:color="D9C9BF" w:sz="4"/>
-              <w:left w:val="single" w:color="D9C9BF" w:sz="4"/>
-              <w:bottom w:val="single" w:color="D9C9BF" w:sz="4"/>
-              <w:right w:val="single" w:color="D9C9BF" w:sz="4"/>
+              <w:top w:val="single" w:color="CFCFCF" w:sz="4"/>
+              <w:left w:val="single" w:color="CFCFCF" w:sz="4"/>
+              <w:bottom w:val="single" w:color="CFCFCF" w:sz="4"/>
+              <w:right w:val="single" w:color="CFCFCF" w:sz="4"/>
             </w:tcBorders>
             <w:tcMar>
               <w:top w:type="dxa" w:w="80"/>
@@ -1551,10 +1551,10 @@
           <w:tcPr>
             <w:tcW w:type="dxa" w:w="1500"/>
             <w:tcBorders>
-              <w:top w:val="single" w:color="D9C9BF" w:sz="4"/>
-              <w:left w:val="single" w:color="D9C9BF" w:sz="4"/>
-              <w:bottom w:val="single" w:color="D9C9BF" w:sz="4"/>
-              <w:right w:val="single" w:color="D9C9BF" w:sz="4"/>
+              <w:top w:val="single" w:color="CFCFCF" w:sz="4"/>
+              <w:left w:val="single" w:color="CFCFCF" w:sz="4"/>
+              <w:bottom w:val="single" w:color="CFCFCF" w:sz="4"/>
+              <w:right w:val="single" w:color="CFCFCF" w:sz="4"/>
             </w:tcBorders>
             <w:shd w:fill="FF3B5C" w:color="auto" w:val="clear"/>
             <w:tcMar>
@@ -1582,10 +1582,10 @@
           <w:tcPr>
             <w:tcW w:type="dxa" w:w="1500"/>
             <w:tcBorders>
-              <w:top w:val="single" w:color="D9C9BF" w:sz="4"/>
-              <w:left w:val="single" w:color="D9C9BF" w:sz="4"/>
-              <w:bottom w:val="single" w:color="D9C9BF" w:sz="4"/>
-              <w:right w:val="single" w:color="D9C9BF" w:sz="4"/>
+              <w:top w:val="single" w:color="CFCFCF" w:sz="4"/>
+              <w:left w:val="single" w:color="CFCFCF" w:sz="4"/>
+              <w:bottom w:val="single" w:color="CFCFCF" w:sz="4"/>
+              <w:right w:val="single" w:color="CFCFCF" w:sz="4"/>
             </w:tcBorders>
             <w:shd w:fill="FF5C7A" w:color="auto" w:val="clear"/>
             <w:tcMar>
@@ -1613,10 +1613,10 @@
           <w:tcPr>
             <w:tcW w:type="dxa" w:w="3660"/>
             <w:tcBorders>
-              <w:top w:val="single" w:color="D9C9BF" w:sz="4"/>
-              <w:left w:val="single" w:color="D9C9BF" w:sz="4"/>
-              <w:bottom w:val="single" w:color="D9C9BF" w:sz="4"/>
-              <w:right w:val="single" w:color="D9C9BF" w:sz="4"/>
+              <w:top w:val="single" w:color="CFCFCF" w:sz="4"/>
+              <w:left w:val="single" w:color="CFCFCF" w:sz="4"/>
+              <w:bottom w:val="single" w:color="CFCFCF" w:sz="4"/>
+              <w:right w:val="single" w:color="CFCFCF" w:sz="4"/>
             </w:tcBorders>
             <w:tcMar>
               <w:top w:type="dxa" w:w="80"/>
@@ -1647,10 +1647,10 @@
           <w:tcPr>
             <w:tcW w:type="dxa" w:w="2700"/>
             <w:tcBorders>
-              <w:top w:val="single" w:color="D9C9BF" w:sz="4"/>
-              <w:left w:val="single" w:color="D9C9BF" w:sz="4"/>
-              <w:bottom w:val="single" w:color="D9C9BF" w:sz="4"/>
-              <w:right w:val="single" w:color="D9C9BF" w:sz="4"/>
+              <w:top w:val="single" w:color="CFCFCF" w:sz="4"/>
+              <w:left w:val="single" w:color="CFCFCF" w:sz="4"/>
+              <w:bottom w:val="single" w:color="CFCFCF" w:sz="4"/>
+              <w:right w:val="single" w:color="CFCFCF" w:sz="4"/>
             </w:tcBorders>
             <w:tcMar>
               <w:top w:type="dxa" w:w="80"/>
@@ -1678,10 +1678,10 @@
           <w:tcPr>
             <w:tcW w:type="dxa" w:w="1500"/>
             <w:tcBorders>
-              <w:top w:val="single" w:color="D9C9BF" w:sz="4"/>
-              <w:left w:val="single" w:color="D9C9BF" w:sz="4"/>
-              <w:bottom w:val="single" w:color="D9C9BF" w:sz="4"/>
-              <w:right w:val="single" w:color="D9C9BF" w:sz="4"/>
+              <w:top w:val="single" w:color="CFCFCF" w:sz="4"/>
+              <w:left w:val="single" w:color="CFCFCF" w:sz="4"/>
+              <w:bottom w:val="single" w:color="CFCFCF" w:sz="4"/>
+              <w:right w:val="single" w:color="CFCFCF" w:sz="4"/>
             </w:tcBorders>
             <w:shd w:fill="FBF5F1" w:color="auto" w:val="clear"/>
             <w:tcMar>
@@ -1709,10 +1709,10 @@
           <w:tcPr>
             <w:tcW w:type="dxa" w:w="1500"/>
             <w:tcBorders>
-              <w:top w:val="single" w:color="D9C9BF" w:sz="4"/>
-              <w:left w:val="single" w:color="D9C9BF" w:sz="4"/>
-              <w:bottom w:val="single" w:color="D9C9BF" w:sz="4"/>
-              <w:right w:val="single" w:color="D9C9BF" w:sz="4"/>
+              <w:top w:val="single" w:color="CFCFCF" w:sz="4"/>
+              <w:left w:val="single" w:color="CFCFCF" w:sz="4"/>
+              <w:bottom w:val="single" w:color="CFCFCF" w:sz="4"/>
+              <w:right w:val="single" w:color="CFCFCF" w:sz="4"/>
             </w:tcBorders>
             <w:shd w:fill="1A100D" w:color="auto" w:val="clear"/>
             <w:tcMar>
@@ -1740,10 +1740,10 @@
           <w:tcPr>
             <w:tcW w:type="dxa" w:w="3660"/>
             <w:tcBorders>
-              <w:top w:val="single" w:color="D9C9BF" w:sz="4"/>
-              <w:left w:val="single" w:color="D9C9BF" w:sz="4"/>
-              <w:bottom w:val="single" w:color="D9C9BF" w:sz="4"/>
-              <w:right w:val="single" w:color="D9C9BF" w:sz="4"/>
+              <w:top w:val="single" w:color="CFCFCF" w:sz="4"/>
+              <w:left w:val="single" w:color="CFCFCF" w:sz="4"/>
+              <w:bottom w:val="single" w:color="CFCFCF" w:sz="4"/>
+              <w:right w:val="single" w:color="CFCFCF" w:sz="4"/>
             </w:tcBorders>
             <w:tcMar>
               <w:top w:type="dxa" w:w="80"/>
@@ -1774,10 +1774,10 @@
           <w:tcPr>
             <w:tcW w:type="dxa" w:w="2700"/>
             <w:tcBorders>
-              <w:top w:val="single" w:color="D9C9BF" w:sz="4"/>
-              <w:left w:val="single" w:color="D9C9BF" w:sz="4"/>
-              <w:bottom w:val="single" w:color="D9C9BF" w:sz="4"/>
-              <w:right w:val="single" w:color="D9C9BF" w:sz="4"/>
+              <w:top w:val="single" w:color="CFCFCF" w:sz="4"/>
+              <w:left w:val="single" w:color="CFCFCF" w:sz="4"/>
+              <w:bottom w:val="single" w:color="CFCFCF" w:sz="4"/>
+              <w:right w:val="single" w:color="CFCFCF" w:sz="4"/>
             </w:tcBorders>
             <w:tcMar>
               <w:top w:type="dxa" w:w="80"/>
@@ -1805,10 +1805,10 @@
           <w:tcPr>
             <w:tcW w:type="dxa" w:w="1500"/>
             <w:tcBorders>
-              <w:top w:val="single" w:color="D9C9BF" w:sz="4"/>
-              <w:left w:val="single" w:color="D9C9BF" w:sz="4"/>
-              <w:bottom w:val="single" w:color="D9C9BF" w:sz="4"/>
-              <w:right w:val="single" w:color="D9C9BF" w:sz="4"/>
+              <w:top w:val="single" w:color="CFCFCF" w:sz="4"/>
+              <w:left w:val="single" w:color="CFCFCF" w:sz="4"/>
+              <w:bottom w:val="single" w:color="CFCFCF" w:sz="4"/>
+              <w:right w:val="single" w:color="CFCFCF" w:sz="4"/>
             </w:tcBorders>
             <w:shd w:fill="271613" w:color="auto" w:val="clear"/>
             <w:tcMar>
@@ -1836,10 +1836,10 @@
           <w:tcPr>
             <w:tcW w:type="dxa" w:w="1500"/>
             <w:tcBorders>
-              <w:top w:val="single" w:color="D9C9BF" w:sz="4"/>
-              <w:left w:val="single" w:color="D9C9BF" w:sz="4"/>
-              <w:bottom w:val="single" w:color="D9C9BF" w:sz="4"/>
-              <w:right w:val="single" w:color="D9C9BF" w:sz="4"/>
+              <w:top w:val="single" w:color="CFCFCF" w:sz="4"/>
+              <w:left w:val="single" w:color="CFCFCF" w:sz="4"/>
+              <w:bottom w:val="single" w:color="CFCFCF" w:sz="4"/>
+              <w:right w:val="single" w:color="CFCFCF" w:sz="4"/>
             </w:tcBorders>
             <w:shd w:fill="FBF0EC" w:color="auto" w:val="clear"/>
             <w:tcMar>
@@ -1867,10 +1867,10 @@
           <w:tcPr>
             <w:tcW w:type="dxa" w:w="3660"/>
             <w:tcBorders>
-              <w:top w:val="single" w:color="D9C9BF" w:sz="4"/>
-              <w:left w:val="single" w:color="D9C9BF" w:sz="4"/>
-              <w:bottom w:val="single" w:color="D9C9BF" w:sz="4"/>
-              <w:right w:val="single" w:color="D9C9BF" w:sz="4"/>
+              <w:top w:val="single" w:color="CFCFCF" w:sz="4"/>
+              <w:left w:val="single" w:color="CFCFCF" w:sz="4"/>
+              <w:bottom w:val="single" w:color="CFCFCF" w:sz="4"/>
+              <w:right w:val="single" w:color="CFCFCF" w:sz="4"/>
             </w:tcBorders>
             <w:tcMar>
               <w:top w:type="dxa" w:w="80"/>
@@ -2381,7 +2381,7 @@
       <w:rFonts w:ascii="Calibri" w:cs="Calibri" w:eastAsia="Calibri" w:hAnsi="Calibri"/>
       <w:b/>
       <w:bCs/>
-      <w:color w:val="D93A0F"/>
+      <w:color w:val="2B2B2B"/>
       <w:sz w:val="32"/>
       <w:szCs w:val="32"/>
     </w:rPr>
@@ -2398,7 +2398,7 @@
       <w:rFonts w:ascii="Calibri" w:cs="Calibri" w:eastAsia="Calibri" w:hAnsi="Calibri"/>
       <w:b/>
       <w:bCs/>
-      <w:color w:val="5A2A1E"/>
+      <w:color w:val="404040"/>
       <w:sz w:val="26"/>
       <w:szCs w:val="26"/>
     </w:rPr>

</xml_diff>

<commit_message>
Docs : liens du site et du dépôt dans la démarche créative
Co-Authored-By: Claude Sonnet 5.5 <noreply@anthropic.com>
Claude-Session: https://claude.ai/code/session_01Tyi6eDbg9tiPNQSmjUDNCJ
</commit_message>
<xml_diff>
--- a/docs/Demarche-creative-HotKB.docx
+++ b/docs/Demarche-creative-HotKB.docx
@@ -45,6 +45,46 @@
         </w:rPr>
         <w:t xml:space="preserve">Web V — Paradigme de programmation fonctionnelle et intégration back-end · Checkpoint #1</w:t>
       </w:r>
+    </w:p>
+    <w:p>
+      <w:pPr>
+        <w:spacing w:after="140" w:line="300"/>
+      </w:pPr>
+      <w:r>
+        <w:rPr>
+          <w:b/>
+          <w:bCs/>
+        </w:rPr>
+        <w:t xml:space="preserve">Site : </w:t>
+      </w:r>
+      <w:hyperlink w:history="1" r:id="rIdcowayrh_a-cqkgjmvntqn">
+        <w:r>
+          <w:rPr>
+            <w:color w:val="0563C1"/>
+            <w:u w:val="single"/>
+          </w:rPr>
+          <w:t xml:space="preserve">https://hotkb.onrender.com</w:t>
+        </w:r>
+      </w:hyperlink>
+      <w:r>
+        <w:t xml:space="preserve">   ·   </w:t>
+      </w:r>
+      <w:r>
+        <w:rPr>
+          <w:b/>
+          <w:bCs/>
+        </w:rPr>
+        <w:t xml:space="preserve">Code source (GitHub) : </w:t>
+      </w:r>
+      <w:hyperlink w:history="1" r:id="rIdkvvjdmrbtuaymxgbkeyo3">
+        <w:r>
+          <w:rPr>
+            <w:color w:val="0563C1"/>
+            <w:u w:val="single"/>
+          </w:rPr>
+          <w:t xml:space="preserve">https://github.com/Exynoes/hotKB</w:t>
+        </w:r>
+      </w:hyperlink>
     </w:p>
     <w:p>
       <w:pPr>

</xml_diff>